<commit_message>
Requisitos do sistema completo
</commit_message>
<xml_diff>
--- a/documentacao/requisitos.docx
+++ b/documentacao/requisitos.docx
@@ -81,7 +81,6 @@
         <w:t>Requisitos do sistema gerenciador de desempenho acadêmico</w:t>
       </w:r>
     </w:p>
-    <w:p/>
     <w:p>
       <w:r>
         <w:t>Requisitos Funcionais</w:t>
@@ -114,10 +113,7 @@
         <w:t xml:space="preserve"> </w:t>
       </w:r>
       <w:r>
-        <w:t>[notas])</w:t>
-      </w:r>
-      <w:r>
-        <w:t>]</w:t>
+        <w:t>[notas])]</w:t>
       </w:r>
       <w:r>
         <w:t>;</w:t>
@@ -201,7 +197,15 @@
         </w:numPr>
       </w:pPr>
       <w:r>
-        <w:t>Geração de arquivo .txt contendo informações sobre o processamento de dados entregando um relatório completo e automático.</w:t>
+        <w:t>Geração de arquivo .</w:t>
+      </w:r>
+      <w:proofErr w:type="spellStart"/>
+      <w:r>
+        <w:t>txt</w:t>
+      </w:r>
+      <w:proofErr w:type="spellEnd"/>
+      <w:r>
+        <w:t xml:space="preserve"> contendo informações sobre o processamento de dados entregando um relatório completo e automático.</w:t>
       </w:r>
     </w:p>
     <w:p>
@@ -281,6 +285,106 @@
       </w:pPr>
       <w:r>
         <w:t>Tratamento de erros</w:t>
+      </w:r>
+      <w:r>
+        <w:t>;</w:t>
+      </w:r>
+    </w:p>
+    <w:p>
+      <w:pPr>
+        <w:pStyle w:val="PargrafodaLista"/>
+        <w:numPr>
+          <w:ilvl w:val="0"/>
+          <w:numId w:val="2"/>
+        </w:numPr>
+      </w:pPr>
+      <w:r>
+        <w:t>Confiabilidade;</w:t>
+      </w:r>
+    </w:p>
+    <w:p>
+      <w:pPr>
+        <w:pStyle w:val="PargrafodaLista"/>
+        <w:numPr>
+          <w:ilvl w:val="0"/>
+          <w:numId w:val="2"/>
+        </w:numPr>
+      </w:pPr>
+      <w:r>
+        <w:t>Precisão.</w:t>
+      </w:r>
+    </w:p>
+    <w:p>
+      <w:pPr>
+        <w:pStyle w:val="PargrafodaLista"/>
+      </w:pPr>
+    </w:p>
+    <w:p>
+      <w:r>
+        <w:t>Regras de negócio</w:t>
+      </w:r>
+      <w:r>
+        <w:t>:</w:t>
+      </w:r>
+    </w:p>
+    <w:p>
+      <w:pPr>
+        <w:pStyle w:val="PargrafodaLista"/>
+        <w:numPr>
+          <w:ilvl w:val="0"/>
+          <w:numId w:val="3"/>
+        </w:numPr>
+      </w:pPr>
+      <w:r>
+        <w:t>O programa deve calcular a média de acordo com as notas do aluno;</w:t>
+      </w:r>
+    </w:p>
+    <w:p>
+      <w:pPr>
+        <w:pStyle w:val="PargrafodaLista"/>
+        <w:numPr>
+          <w:ilvl w:val="0"/>
+          <w:numId w:val="3"/>
+        </w:numPr>
+      </w:pPr>
+      <w:r>
+        <w:t>O aluno que obter média menos do que 7.0 é colocado status de “Recuperação”;</w:t>
+      </w:r>
+    </w:p>
+    <w:p>
+      <w:pPr>
+        <w:pStyle w:val="PargrafodaLista"/>
+        <w:numPr>
+          <w:ilvl w:val="0"/>
+          <w:numId w:val="3"/>
+        </w:numPr>
+      </w:pPr>
+      <w:r>
+        <w:t>Destacar o aluno com a maior média colocando o status de “Top Student”;</w:t>
+      </w:r>
+    </w:p>
+    <w:p>
+      <w:pPr>
+        <w:pStyle w:val="PargrafodaLista"/>
+        <w:numPr>
+          <w:ilvl w:val="0"/>
+          <w:numId w:val="3"/>
+        </w:numPr>
+      </w:pPr>
+      <w:r>
+        <w:t>A quantidade de nota dos alunos pode variar de um para outro;</w:t>
+      </w:r>
+    </w:p>
+    <w:p>
+      <w:pPr>
+        <w:pStyle w:val="PargrafodaLista"/>
+        <w:numPr>
+          <w:ilvl w:val="0"/>
+          <w:numId w:val="3"/>
+        </w:numPr>
+      </w:pPr>
+      <w:r>
+        <w:t>O programa deve ignorar o aluno com notas inválidas e retornar o nome para revisão das notas.</w:t>
       </w:r>
     </w:p>
     <w:sectPr>
@@ -409,6 +513,119 @@
     </w:lvl>
   </w:abstractNum>
   <w:abstractNum w:abstractNumId="1" w15:restartNumberingAfterBreak="0">
+    <w:nsid w:val="6899070E"/>
+    <w:multiLevelType w:val="hybridMultilevel"/>
+    <w:tmpl w:val="C504D026"/>
+    <w:lvl w:ilvl="0" w:tplc="04160001">
+      <w:start w:val="1"/>
+      <w:numFmt w:val="bullet"/>
+      <w:lvlText w:val=""/>
+      <w:lvlJc w:val="left"/>
+      <w:pPr>
+        <w:ind w:left="720" w:hanging="360"/>
+      </w:pPr>
+      <w:rPr>
+        <w:rFonts w:ascii="Symbol" w:hAnsi="Symbol" w:hint="default"/>
+      </w:rPr>
+    </w:lvl>
+    <w:lvl w:ilvl="1" w:tplc="04160003" w:tentative="1">
+      <w:start w:val="1"/>
+      <w:numFmt w:val="bullet"/>
+      <w:lvlText w:val="o"/>
+      <w:lvlJc w:val="left"/>
+      <w:pPr>
+        <w:ind w:left="1440" w:hanging="360"/>
+      </w:pPr>
+      <w:rPr>
+        <w:rFonts w:ascii="Courier New" w:hAnsi="Courier New" w:cs="Courier New" w:hint="default"/>
+      </w:rPr>
+    </w:lvl>
+    <w:lvl w:ilvl="2" w:tplc="04160005" w:tentative="1">
+      <w:start w:val="1"/>
+      <w:numFmt w:val="bullet"/>
+      <w:lvlText w:val=""/>
+      <w:lvlJc w:val="left"/>
+      <w:pPr>
+        <w:ind w:left="2160" w:hanging="360"/>
+      </w:pPr>
+      <w:rPr>
+        <w:rFonts w:ascii="Wingdings" w:hAnsi="Wingdings" w:hint="default"/>
+      </w:rPr>
+    </w:lvl>
+    <w:lvl w:ilvl="3" w:tplc="04160001" w:tentative="1">
+      <w:start w:val="1"/>
+      <w:numFmt w:val="bullet"/>
+      <w:lvlText w:val=""/>
+      <w:lvlJc w:val="left"/>
+      <w:pPr>
+        <w:ind w:left="2880" w:hanging="360"/>
+      </w:pPr>
+      <w:rPr>
+        <w:rFonts w:ascii="Symbol" w:hAnsi="Symbol" w:hint="default"/>
+      </w:rPr>
+    </w:lvl>
+    <w:lvl w:ilvl="4" w:tplc="04160003" w:tentative="1">
+      <w:start w:val="1"/>
+      <w:numFmt w:val="bullet"/>
+      <w:lvlText w:val="o"/>
+      <w:lvlJc w:val="left"/>
+      <w:pPr>
+        <w:ind w:left="3600" w:hanging="360"/>
+      </w:pPr>
+      <w:rPr>
+        <w:rFonts w:ascii="Courier New" w:hAnsi="Courier New" w:cs="Courier New" w:hint="default"/>
+      </w:rPr>
+    </w:lvl>
+    <w:lvl w:ilvl="5" w:tplc="04160005" w:tentative="1">
+      <w:start w:val="1"/>
+      <w:numFmt w:val="bullet"/>
+      <w:lvlText w:val=""/>
+      <w:lvlJc w:val="left"/>
+      <w:pPr>
+        <w:ind w:left="4320" w:hanging="360"/>
+      </w:pPr>
+      <w:rPr>
+        <w:rFonts w:ascii="Wingdings" w:hAnsi="Wingdings" w:hint="default"/>
+      </w:rPr>
+    </w:lvl>
+    <w:lvl w:ilvl="6" w:tplc="04160001" w:tentative="1">
+      <w:start w:val="1"/>
+      <w:numFmt w:val="bullet"/>
+      <w:lvlText w:val=""/>
+      <w:lvlJc w:val="left"/>
+      <w:pPr>
+        <w:ind w:left="5040" w:hanging="360"/>
+      </w:pPr>
+      <w:rPr>
+        <w:rFonts w:ascii="Symbol" w:hAnsi="Symbol" w:hint="default"/>
+      </w:rPr>
+    </w:lvl>
+    <w:lvl w:ilvl="7" w:tplc="04160003" w:tentative="1">
+      <w:start w:val="1"/>
+      <w:numFmt w:val="bullet"/>
+      <w:lvlText w:val="o"/>
+      <w:lvlJc w:val="left"/>
+      <w:pPr>
+        <w:ind w:left="5760" w:hanging="360"/>
+      </w:pPr>
+      <w:rPr>
+        <w:rFonts w:ascii="Courier New" w:hAnsi="Courier New" w:cs="Courier New" w:hint="default"/>
+      </w:rPr>
+    </w:lvl>
+    <w:lvl w:ilvl="8" w:tplc="04160005" w:tentative="1">
+      <w:start w:val="1"/>
+      <w:numFmt w:val="bullet"/>
+      <w:lvlText w:val=""/>
+      <w:lvlJc w:val="left"/>
+      <w:pPr>
+        <w:ind w:left="6480" w:hanging="360"/>
+      </w:pPr>
+      <w:rPr>
+        <w:rFonts w:ascii="Wingdings" w:hAnsi="Wingdings" w:hint="default"/>
+      </w:rPr>
+    </w:lvl>
+  </w:abstractNum>
+  <w:abstractNum w:abstractNumId="2" w15:restartNumberingAfterBreak="0">
     <w:nsid w:val="7C423A3B"/>
     <w:multiLevelType w:val="hybridMultilevel"/>
     <w:tmpl w:val="690ECC5E"/>
@@ -525,6 +742,9 @@
     <w:abstractNumId w:val="0"/>
   </w:num>
   <w:num w:numId="2" w16cid:durableId="1899389594">
+    <w:abstractNumId w:val="2"/>
+  </w:num>
+  <w:num w:numId="3" w16cid:durableId="439569912">
     <w:abstractNumId w:val="1"/>
   </w:num>
 </w:numbering>

</xml_diff>